<commit_message>
Labs T1: retos autocontenidos (setup_lab01 y setup_desafio por separado)
</commit_message>
<xml_diff>
--- a/talleres/t1-fundamentos-linux/guias/Lab01_Terminal_Kali.docx
+++ b/talleres/t1-fundamentos-linux/guias/Lab01_Terminal_Kali.docx
@@ -2113,7 +2113,7 @@
                 <w:sz w:val="19"/>
                 <w:szCs w:val="19"/>
               </w:rPr>
-              <w:t xml:space="preserve">bash track-ciberseguridad-2026/talleres/t1-fundamentos-linux/retos-ctf/preparar_retos.sh</w:t>
+              <w:t xml:space="preserve">bash track-ciberseguridad-2026/talleres/t1-fundamentos-linux/retos-ctf/setup_lab01.sh</w:t>
             </w:r>
           </w:p>
           <w:p>
@@ -2171,7 +2171,7 @@
           <w:sz w:val="21"/>
           <w:szCs w:val="21"/>
         </w:rPr>
-        <w:t xml:space="preserve">ese mismo comando también deja listo el desafío del Lab 02 en </w:t>
+        <w:t xml:space="preserve">si ya clonaste el repositorio antes, omite la línea de </w:t>
       </w:r>
       <w:r>
         <w:rPr>
@@ -2184,20 +2184,20 @@
           <w:sz w:val="21"/>
           <w:szCs w:val="21"/>
         </w:rPr>
-        <w:t xml:space="preserve">~/desafio</w:t>
-      </w:r>
-      <w:r>
-        <w:rPr>
-          <w:rFonts w:ascii="Arial" w:cs="Arial" w:eastAsia="Arial" w:hAnsi="Arial"/>
-          <w:b w:val="false"/>
-          <w:bCs w:val="false"/>
-          <w:i w:val="false"/>
-          <w:iCs w:val="false"/>
-          <w:color w:val="1F2A33"/>
-          <w:sz w:val="21"/>
-          <w:szCs w:val="21"/>
-        </w:rPr>
-        <w:t xml:space="preserve">. Si ya clonaste el repo antes, omite la línea de </w:t>
+        <w:t xml:space="preserve">git clone</w:t>
+      </w:r>
+      <w:r>
+        <w:rPr>
+          <w:rFonts w:ascii="Arial" w:cs="Arial" w:eastAsia="Arial" w:hAnsi="Arial"/>
+          <w:b w:val="false"/>
+          <w:bCs w:val="false"/>
+          <w:i w:val="false"/>
+          <w:iCs w:val="false"/>
+          <w:color w:val="1F2A33"/>
+          <w:sz w:val="21"/>
+          <w:szCs w:val="21"/>
+        </w:rPr>
+        <w:t xml:space="preserve"> y corre solo el </w:t>
       </w:r>
       <w:r>
         <w:rPr>
@@ -2210,7 +2210,7 @@
           <w:sz w:val="21"/>
           <w:szCs w:val="21"/>
         </w:rPr>
-        <w:t xml:space="preserve">git clone</w:t>
+        <w:t xml:space="preserve">setup_lab01.sh</w:t>
       </w:r>
       <w:r>
         <w:rPr>

</xml_diff>